<commit_message>
Update letterheads and logo packs with real SVG files
- Replace all 5 letterhead DOCX files with new versions (Leaderhead 1-5)
- Rebuild all 6 logo ZIPs with authoritative SVG files from _STORY3-LOGOS_SVG.zip
- Each pack now contains 10 files: AI, SVG, PDF, PNG, JPG × Black & White
- Old placeholder SVGs removed; Inline pack SpaceInFilename conflict resolved

Co-Authored-By: Claude Sonnet 4.6 <noreply@anthropic.com>
</commit_message>
<xml_diff>
--- a/assets/letterheads/Story3-Letterhead-1.docx
+++ b/assets/letterheads/Story3-Letterhead-1.docx
@@ -136,7 +136,7 @@
         <w:sz w:val="16"/>
         <w:szCs w:val="16"/>
       </w:rPr>
-      <w:pict w14:anchorId="1144B359">
+      <w:pict w14:anchorId="3F8ED56A">
         <v:shapetype id="_x0000_t75" coordsize="21600,21600" o:spt="75" o:preferrelative="t" path="m@4@5l@4@11@9@11@9@5xe" filled="f" stroked="f">
           <v:stroke joinstyle="miter"/>
           <v:formulas>
@@ -156,7 +156,7 @@
           <v:path o:extrusionok="f" gradientshapeok="t" o:connecttype="rect"/>
           <o:lock v:ext="edit" aspectratio="t"/>
         </v:shapetype>
-        <v:shape id="WordPictureWatermark1" o:spid="_x0000_s1025" type="#_x0000_t75" alt="" style="position:absolute;left:0;text-align:left;margin-left:-21.6pt;margin-top:454.05pt;width:836.25pt;height:289.7pt;z-index:-251657728;mso-wrap-edited:f;mso-width-percent:0;mso-height-percent:0;mso-position-horizontal:absolute;mso-position-horizontal-relative:margin;mso-position-vertical:absolute;mso-position-vertical-relative:margin;mso-width-percent:0;mso-height-percent:0">
+        <v:shape id="WordPictureWatermark1" o:spid="_x0000_s1025" type="#_x0000_t75" alt="" style="position:absolute;left:0;text-align:left;margin-left:-41.95pt;margin-top:472.2pt;width:863.25pt;height:324pt;z-index:-251657728;mso-wrap-edited:f;mso-width-percent:0;mso-height-percent:0;mso-position-horizontal:absolute;mso-position-horizontal-relative:margin;mso-position-vertical:absolute;mso-position-vertical-relative:margin;mso-width-percent:0;mso-height-percent:0">
           <v:imagedata r:id="rId1" o:title="image3"/>
           <w10:wrap anchorx="margin" anchory="margin"/>
         </v:shape>
@@ -365,13 +365,13 @@
         <w:szCs w:val="16"/>
       </w:rPr>
       <w:drawing>
-        <wp:anchor distT="114300" distB="114300" distL="114300" distR="114300" simplePos="0" relativeHeight="251657728" behindDoc="1" locked="0" layoutInCell="1" hidden="0" allowOverlap="1" wp14:anchorId="1A3B880B" wp14:editId="08D97B95">
+        <wp:anchor distT="114300" distB="114300" distL="114300" distR="114300" simplePos="0" relativeHeight="251657728" behindDoc="1" locked="0" layoutInCell="1" hidden="0" allowOverlap="1" wp14:anchorId="1A3B880B" wp14:editId="5174B72B">
           <wp:simplePos x="0" y="0"/>
           <wp:positionH relativeFrom="margin">
-            <wp:posOffset>444645</wp:posOffset>
+            <wp:posOffset>447472</wp:posOffset>
           </wp:positionH>
           <wp:positionV relativeFrom="margin">
-            <wp:posOffset>-1630680</wp:posOffset>
+            <wp:posOffset>-1626357</wp:posOffset>
           </wp:positionV>
           <wp:extent cx="1683385" cy="459740"/>
           <wp:effectExtent l="0" t="0" r="5715" b="0"/>
@@ -382,12 +382,18 @@
             <a:graphicData uri="http://schemas.openxmlformats.org/drawingml/2006/picture">
               <pic:pic xmlns:pic="http://schemas.openxmlformats.org/drawingml/2006/picture">
                 <pic:nvPicPr>
-                  <pic:cNvPr id="0" name="image2.png"/>
+                  <pic:cNvPr id="2" name="image2.png"/>
                   <pic:cNvPicPr preferRelativeResize="0"/>
                 </pic:nvPicPr>
-                <pic:blipFill>
-                  <a:blip r:embed="rId1"/>
-                  <a:srcRect l="-1415" t="-5488" r="-1415" b="-5488"/>
+                <pic:blipFill rotWithShape="1">
+                  <a:blip r:embed="rId1">
+                    <a:extLst>
+                      <a:ext uri="{96DAC541-7B7A-43D3-8B79-37D633B846F1}">
+                        <asvg:svgBlip xmlns:asvg="http://schemas.microsoft.com/office/drawing/2016/SVG/main" r:embed="rId2"/>
+                      </a:ext>
+                    </a:extLst>
+                  </a:blip>
+                  <a:srcRect t="-2915" b="-2913"/>
                   <a:stretch>
                     <a:fillRect/>
                   </a:stretch>
@@ -400,7 +406,6 @@
                   <a:prstGeom prst="rect">
                     <a:avLst/>
                   </a:prstGeom>
-                  <a:ln/>
                 </pic:spPr>
               </pic:pic>
             </a:graphicData>
@@ -485,7 +490,7 @@
                   <pic:cNvPicPr preferRelativeResize="0"/>
                 </pic:nvPicPr>
                 <pic:blipFill>
-                  <a:blip r:embed="rId2"/>
+                  <a:blip r:embed="rId3"/>
                   <a:srcRect/>
                   <a:stretch>
                     <a:fillRect/>

</xml_diff>